<commit_message>
fix: red for gains, green for losses in heatmap and contribution bar
- Heatmap: RdYlGn → RdYlGn_r (red=positive returns, green=negative)
- Contribution bar: sector colors → red for positive, green for negative
- Updated legend from 行业 to 方向 (正贡献/负贡献)
- Regenerated all affected PNGs (report + poster versions)
- Re-rendered poster PDF and Word report
</commit_message>
<xml_diff>
--- a/downloads/策略报告.docx
+++ b/downloads/策略报告.docx
@@ -123,26 +123,53 @@
         <w:rPr>
           <w:rFonts w:hint="eastAsia"/>
         </w:rPr>
-        <w:t xml:space="preserve">下载链接：策略报告，</w:t>
-      </w:r>
+        <w:t xml:space="preserve">下载链接：</w:t>
+      </w:r>
+      <w:hyperlink r:id="rId9">
+        <w:r>
+          <w:rPr>
+            <w:rStyle w:val="Hyperlink"/>
+            <w:rFonts w:hint="eastAsia"/>
+          </w:rPr>
+          <w:t xml:space="preserve">策略报告</w:t>
+        </w:r>
+      </w:hyperlink>
       <w:r>
         <w:t xml:space="preserve"> </w:t>
       </w:r>
       <w:r>
-        <w:rPr>
-          <w:rFonts w:hint="eastAsia"/>
-        </w:rPr>
-        <w:t xml:space="preserve">策略海报，</w:t>
+        <w:t xml:space="preserve">|</w:t>
       </w:r>
       <w:r>
         <w:t xml:space="preserve"> </w:t>
       </w:r>
-      <w:r>
-        <w:rPr>
-          <w:rFonts w:hint="eastAsia"/>
-        </w:rPr>
-        <w:t xml:space="preserve">策略附件</w:t>
-      </w:r>
+      <w:hyperlink r:id="rId10">
+        <w:r>
+          <w:rPr>
+            <w:rStyle w:val="Hyperlink"/>
+            <w:rFonts w:hint="eastAsia"/>
+          </w:rPr>
+          <w:t xml:space="preserve">策略海报</w:t>
+        </w:r>
+      </w:hyperlink>
+      <w:r>
+        <w:t xml:space="preserve"> </w:t>
+      </w:r>
+      <w:r>
+        <w:t xml:space="preserve">|</w:t>
+      </w:r>
+      <w:r>
+        <w:t xml:space="preserve"> </w:t>
+      </w:r>
+      <w:hyperlink r:id="rId11">
+        <w:r>
+          <w:rPr>
+            <w:rStyle w:val="Hyperlink"/>
+            <w:rFonts w:hint="eastAsia"/>
+          </w:rPr>
+          <w:t xml:space="preserve">策略附件</w:t>
+        </w:r>
+      </w:hyperlink>
     </w:p>
     <w:p>
       <w:r>
@@ -151,7 +178,7 @@
         </w:pict>
       </w:r>
     </w:p>
-    <w:bookmarkStart w:id="9" w:name="目录"/>
+    <w:bookmarkStart w:id="12" w:name="目录"/>
     <w:p>
       <w:pPr>
         <w:pStyle w:val="Heading1"/>
@@ -944,8 +971,8 @@
         </w:pict>
       </w:r>
     </w:p>
-    <w:bookmarkEnd w:id="9"/>
-    <w:bookmarkStart w:id="13" w:name="第1章-研究问题与目标"/>
+    <w:bookmarkEnd w:id="12"/>
+    <w:bookmarkStart w:id="16" w:name="第1章-研究问题与目标"/>
     <w:p>
       <w:pPr>
         <w:pStyle w:val="Heading1"/>
@@ -966,7 +993,7 @@
         <w:t xml:space="preserve">研究问题与目标</w:t>
       </w:r>
     </w:p>
-    <w:bookmarkStart w:id="10" w:name="研究问题"/>
+    <w:bookmarkStart w:id="13" w:name="研究问题"/>
     <w:p>
       <w:pPr>
         <w:pStyle w:val="Heading2"/>
@@ -1084,8 +1111,8 @@
         <w:t xml:space="preserve">指数？</w:t>
       </w:r>
     </w:p>
-    <w:bookmarkEnd w:id="10"/>
-    <w:bookmarkStart w:id="11" w:name="事先设定的成功标准"/>
+    <w:bookmarkEnd w:id="13"/>
+    <w:bookmarkStart w:id="14" w:name="事先设定的成功标准"/>
     <w:p>
       <w:pPr>
         <w:pStyle w:val="Heading2"/>
@@ -1193,8 +1220,8 @@
         <w:t xml:space="preserve">（风险控制目标）</w:t>
       </w:r>
     </w:p>
-    <w:bookmarkEnd w:id="11"/>
-    <w:bookmarkStart w:id="12" w:name="本次明确不做的事项"/>
+    <w:bookmarkEnd w:id="14"/>
+    <w:bookmarkStart w:id="15" w:name="本次明确不做的事项"/>
     <w:p>
       <w:pPr>
         <w:pStyle w:val="Heading2"/>
@@ -1254,9 +1281,9 @@
         <w:t xml:space="preserve">不做高频交易，仅月度调仓</w:t>
       </w:r>
     </w:p>
-    <w:bookmarkEnd w:id="12"/>
-    <w:bookmarkEnd w:id="13"/>
-    <w:bookmarkStart w:id="22" w:name="第2章-数据说明"/>
+    <w:bookmarkEnd w:id="15"/>
+    <w:bookmarkEnd w:id="16"/>
+    <w:bookmarkStart w:id="25" w:name="第2章-数据说明"/>
     <w:p>
       <w:pPr>
         <w:pStyle w:val="Heading1"/>
@@ -1277,7 +1304,7 @@
         <w:t xml:space="preserve">数据说明</w:t>
       </w:r>
     </w:p>
-    <w:bookmarkStart w:id="15" w:name="股票池20只与聚焦10只"/>
+    <w:bookmarkStart w:id="18" w:name="股票池20只与聚焦10只"/>
     <w:p>
       <w:pPr>
         <w:pStyle w:val="Heading2"/>
@@ -3364,7 +3391,7 @@
         <w:t xml:space="preserve">：人工预设的10只中有3只（同仁堂、恒瑞医药、百济神州）从未被策略选中，红利ETF同样未被选中；而策略实际高频选中的江波龙（16次）、佰维存储（15次）在预设名单中均标为”否”。策略动态选出的10只持仓股票为：德明利、江波龙、佰维存储、普冉股份、兆易创新、泡泡玛特、腾讯控股、达仁堂、美的集团、伊利股份，与人工预设名单仅有5只重合。</w:t>
       </w:r>
     </w:p>
-    <w:bookmarkStart w:id="14" w:name="聚焦10只股票的行业分布"/>
+    <w:bookmarkStart w:id="17" w:name="聚焦10只股票的行业分布"/>
     <w:p>
       <w:pPr>
         <w:pStyle w:val="Heading3"/>
@@ -3614,9 +3641,9 @@
         </w:tc>
       </w:tr>
     </w:tbl>
-    <w:bookmarkEnd w:id="14"/>
-    <w:bookmarkEnd w:id="15"/>
-    <w:bookmarkStart w:id="18" w:name="数据来源和字段字典"/>
+    <w:bookmarkEnd w:id="17"/>
+    <w:bookmarkEnd w:id="18"/>
+    <w:bookmarkStart w:id="21" w:name="数据来源和字段字典"/>
     <w:p>
       <w:pPr>
         <w:pStyle w:val="Heading2"/>
@@ -3631,7 +3658,7 @@
         <w:t xml:space="preserve">数据来源和字段字典</w:t>
       </w:r>
     </w:p>
-    <w:bookmarkStart w:id="16" w:name="数据来源"/>
+    <w:bookmarkStart w:id="19" w:name="数据来源"/>
     <w:p>
       <w:pPr>
         <w:pStyle w:val="Heading3"/>
@@ -4105,8 +4132,8 @@
         </w:tc>
       </w:tr>
     </w:tbl>
-    <w:bookmarkEnd w:id="16"/>
-    <w:bookmarkStart w:id="17" w:name="字段字典"/>
+    <w:bookmarkEnd w:id="19"/>
+    <w:bookmarkStart w:id="20" w:name="字段字典"/>
     <w:p>
       <w:pPr>
         <w:pStyle w:val="Heading3"/>
@@ -5587,9 +5614,9 @@
         <w:t xml:space="preserve">列实时计算。</w:t>
       </w:r>
     </w:p>
-    <w:bookmarkEnd w:id="17"/>
-    <w:bookmarkEnd w:id="18"/>
-    <w:bookmarkStart w:id="19" w:name="文件说明"/>
+    <w:bookmarkEnd w:id="20"/>
+    <w:bookmarkEnd w:id="21"/>
+    <w:bookmarkStart w:id="22" w:name="文件说明"/>
     <w:p>
       <w:pPr>
         <w:pStyle w:val="Heading2"/>
@@ -5836,8 +5863,8 @@
         <w:t xml:space="preserve">分红数据手动前复权</w:t>
       </w:r>
     </w:p>
-    <w:bookmarkEnd w:id="19"/>
-    <w:bookmarkStart w:id="20" w:name="质量处理"/>
+    <w:bookmarkEnd w:id="22"/>
+    <w:bookmarkStart w:id="23" w:name="质量处理"/>
     <w:p>
       <w:pPr>
         <w:pStyle w:val="Heading2"/>
@@ -6079,8 +6106,8 @@
         <w:t xml:space="preserve">，与组合净值同期归一化至1。</w:t>
       </w:r>
     </w:p>
-    <w:bookmarkEnd w:id="20"/>
-    <w:bookmarkStart w:id="21" w:name="回测区间"/>
+    <w:bookmarkEnd w:id="23"/>
+    <w:bookmarkStart w:id="24" w:name="回测区间"/>
     <w:p>
       <w:pPr>
         <w:pStyle w:val="Heading2"/>
@@ -6205,9 +6232,9 @@
         <w:t xml:space="preserve">：每月5只，等权配置（各20%）</w:t>
       </w:r>
     </w:p>
-    <w:bookmarkEnd w:id="21"/>
-    <w:bookmarkEnd w:id="22"/>
-    <w:bookmarkStart w:id="28" w:name="第3章-策略设计"/>
+    <w:bookmarkEnd w:id="24"/>
+    <w:bookmarkEnd w:id="25"/>
+    <w:bookmarkStart w:id="31" w:name="第3章-策略设计"/>
     <w:p>
       <w:pPr>
         <w:pStyle w:val="Heading1"/>
@@ -6228,7 +6255,7 @@
         <w:t xml:space="preserve">策略设计</w:t>
       </w:r>
     </w:p>
-    <w:bookmarkStart w:id="26" w:name="关键设定"/>
+    <w:bookmarkStart w:id="29" w:name="关键设定"/>
     <w:p>
       <w:pPr>
         <w:pStyle w:val="Heading2"/>
@@ -6578,7 +6605,7 @@
         </w:tc>
       </w:tr>
     </w:tbl>
-    <w:bookmarkStart w:id="23" w:name="三因子定义"/>
+    <w:bookmarkStart w:id="26" w:name="三因子定义"/>
     <w:p>
       <w:pPr>
         <w:pStyle w:val="Heading3"/>
@@ -8078,8 +8105,8 @@
         <w:t xml:space="preserve">的配比在回测中取得了210.8%的总收益，验证了动量主导、基本面辅助的配置逻辑。</w:t>
       </w:r>
     </w:p>
-    <w:bookmarkEnd w:id="23"/>
-    <w:bookmarkStart w:id="24" w:name="选股流程"/>
+    <w:bookmarkEnd w:id="26"/>
+    <w:bookmarkStart w:id="27" w:name="选股流程"/>
     <w:p>
       <w:pPr>
         <w:pStyle w:val="Heading3"/>
@@ -8356,8 +8383,8 @@
         <w:t xml:space="preserve">J[持有至下月调仓日]</w:t>
       </w:r>
     </w:p>
-    <w:bookmarkEnd w:id="24"/>
-    <w:bookmarkStart w:id="25" w:name="风控规则"/>
+    <w:bookmarkEnd w:id="27"/>
+    <w:bookmarkStart w:id="28" w:name="风控规则"/>
     <w:p>
       <w:pPr>
         <w:pStyle w:val="Heading3"/>
@@ -8380,9 +8407,9 @@
         <w:t xml:space="preserve">15%回撤控制：每日监控组合净值，若相对历史峰值的回撤超过15%，则全部转为现金（收益率为0），直至下一个调仓日重新按规则建仓。</w:t>
       </w:r>
     </w:p>
-    <w:bookmarkEnd w:id="25"/>
-    <w:bookmarkEnd w:id="26"/>
-    <w:bookmarkStart w:id="27" w:name="可复现步骤"/>
+    <w:bookmarkEnd w:id="28"/>
+    <w:bookmarkEnd w:id="29"/>
+    <w:bookmarkStart w:id="30" w:name="可复现步骤"/>
     <w:p>
       <w:pPr>
         <w:pStyle w:val="Heading2"/>
@@ -8626,9 +8653,9 @@
         <w:t xml:space="preserve">：净值曲线、回撤曲线、月度收益热力图，并输出绩效统计表。</w:t>
       </w:r>
     </w:p>
-    <w:bookmarkEnd w:id="27"/>
-    <w:bookmarkEnd w:id="28"/>
-    <w:bookmarkStart w:id="40" w:name="第4章-核心结果10只股票组合"/>
+    <w:bookmarkEnd w:id="30"/>
+    <w:bookmarkEnd w:id="31"/>
+    <w:bookmarkStart w:id="43" w:name="第4章-核心结果10只股票组合"/>
     <w:p>
       <w:pPr>
         <w:pStyle w:val="Heading1"/>
@@ -8649,7 +8676,7 @@
         <w:t xml:space="preserve">核心结果（10只股票组合）</w:t>
       </w:r>
     </w:p>
-    <w:bookmarkStart w:id="29" w:name="执行摘要"/>
+    <w:bookmarkStart w:id="32" w:name="执行摘要"/>
     <w:p>
       <w:pPr>
         <w:pStyle w:val="Heading2"/>
@@ -9157,8 +9184,8 @@
         <w:t xml:space="preserve">三项成功标准全部通过。</w:t>
       </w:r>
     </w:p>
-    <w:bookmarkEnd w:id="29"/>
-    <w:bookmarkStart w:id="30" w:name="绩效总表"/>
+    <w:bookmarkEnd w:id="32"/>
+    <w:bookmarkStart w:id="33" w:name="绩效总表"/>
     <w:p>
       <w:pPr>
         <w:pStyle w:val="Heading2"/>
@@ -9569,8 +9596,8 @@
         </w:tc>
       </w:tr>
     </w:tbl>
-    <w:bookmarkEnd w:id="30"/>
-    <w:bookmarkStart w:id="39" w:name="必做三图"/>
+    <w:bookmarkEnd w:id="33"/>
+    <w:bookmarkStart w:id="42" w:name="必做三图"/>
     <w:p>
       <w:pPr>
         <w:pStyle w:val="Heading2"/>
@@ -9585,7 +9612,7 @@
         <w:t xml:space="preserve">必做三图</w:t>
       </w:r>
     </w:p>
-    <w:bookmarkStart w:id="34" w:name="图1净值曲线与动态回撤"/>
+    <w:bookmarkStart w:id="37" w:name="图1净值曲线与动态回撤"/>
     <w:p>
       <w:pPr>
         <w:pStyle w:val="Heading3"/>
@@ -9606,18 +9633,18 @@
           <wp:inline>
             <wp:extent cx="5334000" cy="4599608"/>
             <wp:effectExtent b="0" l="0" r="0" t="0"/>
-            <wp:docPr descr="图1：净值曲线与动态回撤" title="" id="32" name="Picture"/>
+            <wp:docPr descr="图1：净值曲线与动态回撤" title="" id="35" name="Picture"/>
             <a:graphic>
               <a:graphicData uri="http://schemas.openxmlformats.org/drawingml/2006/picture">
                 <pic:pic>
                   <pic:nvPicPr>
-                    <pic:cNvPr descr="fig_nav_drawdown_combined.png" id="33" name="Picture"/>
+                    <pic:cNvPr descr="fig_nav_drawdown_combined.png" id="36" name="Picture"/>
                     <pic:cNvPicPr>
                       <a:picLocks noChangeArrowheads="1" noChangeAspect="1"/>
                     </pic:cNvPicPr>
                   </pic:nvPicPr>
                   <pic:blipFill>
-                    <a:blip r:embed="rId31"/>
+                    <a:blip r:embed="rId34"/>
                     <a:stretch>
                       <a:fillRect/>
                     </a:stretch>
@@ -10180,8 +10207,8 @@
         <w:t xml:space="preserve">天即恢复），可能产生不必要的切换成本。</w:t>
       </w:r>
     </w:p>
-    <w:bookmarkEnd w:id="34"/>
-    <w:bookmarkStart w:id="38" w:name="图2月度收益热力图"/>
+    <w:bookmarkEnd w:id="37"/>
+    <w:bookmarkStart w:id="41" w:name="图2月度收益热力图"/>
     <w:p>
       <w:pPr>
         <w:pStyle w:val="Heading3"/>
@@ -10202,18 +10229,18 @@
           <wp:inline>
             <wp:extent cx="5334000" cy="2790384"/>
             <wp:effectExtent b="0" l="0" r="0" t="0"/>
-            <wp:docPr descr="图2：月度收益热力图" title="" id="36" name="Picture"/>
+            <wp:docPr descr="图2：月度收益热力图" title="" id="39" name="Picture"/>
             <a:graphic>
               <a:graphicData uri="http://schemas.openxmlformats.org/drawingml/2006/picture">
                 <pic:pic>
                   <pic:nvPicPr>
-                    <pic:cNvPr descr="fig3_monthly_heatmap.png" id="37" name="Picture"/>
+                    <pic:cNvPr descr="fig3_monthly_heatmap.png" id="40" name="Picture"/>
                     <pic:cNvPicPr>
                       <a:picLocks noChangeArrowheads="1" noChangeAspect="1"/>
                     </pic:cNvPicPr>
                   </pic:nvPicPr>
                   <pic:blipFill>
-                    <a:blip r:embed="rId35"/>
+                    <a:blip r:embed="rId38"/>
                     <a:stretch>
                       <a:fillRect/>
                     </a:stretch>
@@ -10308,10 +10335,10 @@
         <w:t xml:space="preserve">：策略收益高度集中于少数月份和少数板块，存在风格暴露集中的风险。</w:t>
       </w:r>
     </w:p>
-    <w:bookmarkEnd w:id="38"/>
-    <w:bookmarkEnd w:id="39"/>
-    <w:bookmarkEnd w:id="40"/>
-    <w:bookmarkStart w:id="53" w:name="第5章-细分分析"/>
+    <w:bookmarkEnd w:id="41"/>
+    <w:bookmarkEnd w:id="42"/>
+    <w:bookmarkEnd w:id="43"/>
+    <w:bookmarkStart w:id="56" w:name="第5章-细分分析"/>
     <w:p>
       <w:pPr>
         <w:pStyle w:val="Heading1"/>
@@ -10332,7 +10359,7 @@
         <w:t xml:space="preserve">细分分析</w:t>
       </w:r>
     </w:p>
-    <w:bookmarkStart w:id="44" w:name="聚焦10只个股表现表"/>
+    <w:bookmarkStart w:id="47" w:name="聚焦10只个股表现表"/>
     <w:p>
       <w:pPr>
         <w:pStyle w:val="Heading2"/>
@@ -11589,18 +11616,18 @@
           <wp:inline>
             <wp:extent cx="5334000" cy="3564027"/>
             <wp:effectExtent b="0" l="0" r="0" t="0"/>
-            <wp:docPr descr="图3：聚焦10只个股 — 风险-收益散点图" title="" id="42" name="Picture"/>
+            <wp:docPr descr="图3：聚焦10只个股 — 风险-收益散点图" title="" id="45" name="Picture"/>
             <a:graphic>
               <a:graphicData uri="http://schemas.openxmlformats.org/drawingml/2006/picture">
                 <pic:pic>
                   <pic:nvPicPr>
-                    <pic:cNvPr descr="fig_focus10_risk_return.png" id="43" name="Picture"/>
+                    <pic:cNvPr descr="fig_focus10_risk_return.png" id="46" name="Picture"/>
                     <pic:cNvPicPr>
                       <a:picLocks noChangeArrowheads="1" noChangeAspect="1"/>
                     </pic:cNvPicPr>
                   </pic:nvPicPr>
                   <pic:blipFill>
-                    <a:blip r:embed="rId41"/>
+                    <a:blip r:embed="rId44"/>
                     <a:stretch>
                       <a:fillRect/>
                     </a:stretch>
@@ -11810,8 +11837,8 @@
         <w:t xml:space="preserve">的进攻型半导体股，在结构性行情中实现了优异的风险调整收益，但同时也形成了对单一板块的高度依赖。</w:t>
       </w:r>
     </w:p>
-    <w:bookmarkEnd w:id="44"/>
-    <w:bookmarkStart w:id="48" w:name="贡献说明"/>
+    <w:bookmarkEnd w:id="47"/>
+    <w:bookmarkStart w:id="51" w:name="贡献说明"/>
     <w:p>
       <w:pPr>
         <w:pStyle w:val="Heading2"/>
@@ -11964,18 +11991,18 @@
           <wp:inline>
             <wp:extent cx="5334000" cy="4460508"/>
             <wp:effectExtent b="0" l="0" r="0" t="0"/>
-            <wp:docPr descr="图4：个股贡献度排名" title="" id="46" name="Picture"/>
+            <wp:docPr descr="图4：个股贡献度排名" title="" id="49" name="Picture"/>
             <a:graphic>
               <a:graphicData uri="http://schemas.openxmlformats.org/drawingml/2006/picture">
                 <pic:pic>
                   <pic:nvPicPr>
-                    <pic:cNvPr descr="fig_contrib_bar.png" id="47" name="Picture"/>
+                    <pic:cNvPr descr="fig_contrib_bar.png" id="50" name="Picture"/>
                     <pic:cNvPicPr>
                       <a:picLocks noChangeArrowheads="1" noChangeAspect="1"/>
                     </pic:cNvPicPr>
                   </pic:nvPicPr>
                   <pic:blipFill>
-                    <a:blip r:embed="rId45"/>
+                    <a:blip r:embed="rId48"/>
                     <a:stretch>
                       <a:fillRect/>
                     </a:stretch>
@@ -12196,8 +12223,8 @@
         <w:t xml:space="preserve">2013)，但也意味着若存储芯片板块发生系统性回调，策略收益将受到严重冲击。</w:t>
       </w:r>
     </w:p>
-    <w:bookmarkEnd w:id="48"/>
-    <w:bookmarkStart w:id="49" w:name="市场环境表现"/>
+    <w:bookmarkEnd w:id="51"/>
+    <w:bookmarkStart w:id="52" w:name="市场环境表现"/>
     <w:p>
       <w:pPr>
         <w:pStyle w:val="Heading2"/>
@@ -13078,8 +13105,8 @@
         <w:t xml:space="preserve">策略在上涨市和下跌市中均跑赢基准。在震荡市中4个季度有3个跑赢，唯一例外是2026Q3（科技股回调），策略因重仓存储芯片而小幅跑输基准，但回撤控制机制限制了损失幅度。</w:t>
       </w:r>
     </w:p>
-    <w:bookmarkEnd w:id="49"/>
-    <w:bookmarkStart w:id="52" w:name="攻防风格分析"/>
+    <w:bookmarkEnd w:id="52"/>
+    <w:bookmarkStart w:id="55" w:name="攻防风格分析"/>
     <w:p>
       <w:pPr>
         <w:pStyle w:val="Heading2"/>
@@ -13094,7 +13121,7 @@
         <w:t xml:space="preserve">攻防风格分析</w:t>
       </w:r>
     </w:p>
-    <w:bookmarkStart w:id="50" w:name="风格分类"/>
+    <w:bookmarkStart w:id="53" w:name="风格分类"/>
     <w:p>
       <w:pPr>
         <w:pStyle w:val="Heading3"/>
@@ -13709,8 +13736,8 @@
         <w:t xml:space="preserve">-1.2%~-12.4%。红利ETF波动率最低（12.1%）、回撤最浅（-13.6%），是天然的防御锚。</w:t>
       </w:r>
     </w:p>
-    <w:bookmarkEnd w:id="50"/>
-    <w:bookmarkStart w:id="51" w:name="季度攻防切换"/>
+    <w:bookmarkEnd w:id="53"/>
+    <w:bookmarkStart w:id="54" w:name="季度攻防切换"/>
     <w:p>
       <w:pPr>
         <w:pStyle w:val="Heading3"/>
@@ -14576,10 +14603,10 @@
         <w:t xml:space="preserve">：7月科技股回调后，策略仅选出4次进攻型持仓，动量信号大幅衰减</w:t>
       </w:r>
     </w:p>
-    <w:bookmarkEnd w:id="51"/>
-    <w:bookmarkEnd w:id="52"/>
-    <w:bookmarkEnd w:id="53"/>
-    <w:bookmarkStart w:id="60" w:name="第6章-结论局限与下一步"/>
+    <w:bookmarkEnd w:id="54"/>
+    <w:bookmarkEnd w:id="55"/>
+    <w:bookmarkEnd w:id="56"/>
+    <w:bookmarkStart w:id="63" w:name="第6章-结论局限与下一步"/>
     <w:p>
       <w:pPr>
         <w:pStyle w:val="Heading1"/>
@@ -14600,7 +14627,7 @@
         <w:t xml:space="preserve">结论、局限与下一步</w:t>
       </w:r>
     </w:p>
-    <w:bookmarkStart w:id="54" w:name="结论"/>
+    <w:bookmarkStart w:id="57" w:name="结论"/>
     <w:p>
       <w:pPr>
         <w:pStyle w:val="Heading2"/>
@@ -14660,8 +14687,8 @@
         <w:t xml:space="preserve">策略收益高度来源于动量因子对存储芯片板块的捕捉，德明利、江波龙、佰维存储三只股票合计贡献约124%的组合收益，是超额收益的核心来源；攻防风格分析显示策略在2026Q1下跌市中仍全面进攻，暴露了动量因子在趋势拐点的滞后性。</w:t>
       </w:r>
     </w:p>
-    <w:bookmarkEnd w:id="54"/>
-    <w:bookmarkStart w:id="55" w:name="局限"/>
+    <w:bookmarkEnd w:id="57"/>
+    <w:bookmarkStart w:id="58" w:name="局限"/>
     <w:p>
       <w:pPr>
         <w:pStyle w:val="Heading2"/>
@@ -14803,8 +14830,8 @@
         <w:t xml:space="preserve">1993)；（2）15%回撤控制是”一刀切”式全仓转现金，缺乏渐进式防御过渡。</w:t>
       </w:r>
     </w:p>
-    <w:bookmarkEnd w:id="55"/>
-    <w:bookmarkStart w:id="59" w:name="下一步"/>
+    <w:bookmarkEnd w:id="58"/>
+    <w:bookmarkStart w:id="62" w:name="下一步"/>
     <w:p>
       <w:pPr>
         <w:pStyle w:val="Heading2"/>
@@ -15398,18 +15425,18 @@
           <wp:inline>
             <wp:extent cx="5334000" cy="3251463"/>
             <wp:effectExtent b="0" l="0" r="0" t="0"/>
-            <wp:docPr descr="图5：空仓期持有现金 vs 红利ETF 净值与回撤对比" title="" id="57" name="Picture"/>
+            <wp:docPr descr="图5：空仓期持有现金 vs 红利ETF 净值与回撤对比" title="" id="60" name="Picture"/>
             <a:graphic>
               <a:graphicData uri="http://schemas.openxmlformats.org/drawingml/2006/picture">
                 <pic:pic>
                   <pic:nvPicPr>
-                    <pic:cNvPr descr="fig_etf_vs_cash.png" id="58" name="Picture"/>
+                    <pic:cNvPr descr="fig_etf_vs_cash.png" id="61" name="Picture"/>
                     <pic:cNvPicPr>
                       <a:picLocks noChangeArrowheads="1" noChangeAspect="1"/>
                     </pic:cNvPicPr>
                   </pic:nvPicPr>
                   <pic:blipFill>
-                    <a:blip r:embed="rId56"/>
+                    <a:blip r:embed="rId59"/>
                     <a:stretch>
                       <a:fillRect/>
                     </a:stretch>
@@ -15535,9 +15562,9 @@
         <w:t xml:space="preserve">：空仓期持有ETF能在收益端带来改善（+13.4pp），但在风控端突破了预设的15%回撤约束，夏普比率小幅上升而卡玛比率下降，说明风险调整后的下行保护变差。后续可探索延迟1–2个交易日再切换ETF以规避触发日冲击，或使用国债逆回购等低相关性资产替代，在收益与回撤之间寻找更优平衡点。</w:t>
       </w:r>
     </w:p>
-    <w:bookmarkEnd w:id="59"/>
-    <w:bookmarkEnd w:id="60"/>
-    <w:bookmarkStart w:id="61" w:name="参考文献"/>
+    <w:bookmarkEnd w:id="62"/>
+    <w:bookmarkEnd w:id="63"/>
+    <w:bookmarkStart w:id="64" w:name="参考文献"/>
     <w:p>
       <w:pPr>
         <w:pStyle w:val="Heading1"/>
@@ -15765,8 +15792,8 @@
         <w:t xml:space="preserve">, 3(1), 23–40.</w:t>
       </w:r>
     </w:p>
-    <w:bookmarkEnd w:id="61"/>
-    <w:bookmarkStart w:id="69" w:name="附录"/>
+    <w:bookmarkEnd w:id="64"/>
+    <w:bookmarkStart w:id="72" w:name="附录"/>
     <w:p>
       <w:pPr>
         <w:pStyle w:val="Heading1"/>
@@ -15778,7 +15805,7 @@
         <w:t xml:space="preserve">附录</w:t>
       </w:r>
     </w:p>
-    <w:bookmarkStart w:id="63" w:name="附录a20只股票完整列表与数据文件"/>
+    <w:bookmarkStart w:id="66" w:name="附录a20只股票完整列表与数据文件"/>
     <w:p>
       <w:pPr>
         <w:pStyle w:val="Heading2"/>
@@ -15810,7 +15837,7 @@
         <w:t xml:space="preserve">股票池与聚焦10只个股表。</w:t>
       </w:r>
     </w:p>
-    <w:bookmarkStart w:id="62" w:name="数据文件"/>
+    <w:bookmarkStart w:id="65" w:name="数据文件"/>
     <w:p>
       <w:pPr>
         <w:pStyle w:val="Heading3"/>
@@ -16127,9 +16154,9 @@
         </w:tc>
       </w:tr>
     </w:tbl>
-    <w:bookmarkEnd w:id="62"/>
-    <w:bookmarkEnd w:id="63"/>
-    <w:bookmarkStart w:id="66" w:name="附录bcsv字段与文件路径见2.2和2.3"/>
+    <w:bookmarkEnd w:id="65"/>
+    <w:bookmarkEnd w:id="66"/>
+    <w:bookmarkStart w:id="69" w:name="附录bcsv字段与文件路径见2.2和2.3"/>
     <w:p>
       <w:pPr>
         <w:pStyle w:val="Heading2"/>
@@ -16170,7 +16197,7 @@
         <w:t xml:space="preserve">文件说明。以下补充两个数据文件的详细说明。</w:t>
       </w:r>
     </w:p>
-    <w:bookmarkStart w:id="64" w:name="price_qfq_20240719_20260721.csv-前复权日线数据"/>
+    <w:bookmarkStart w:id="67" w:name="price_qfq_20240719_20260721.csv-前复权日线数据"/>
     <w:p>
       <w:pPr>
         <w:pStyle w:val="Heading3"/>
@@ -16804,8 +16831,8 @@
         </w:tc>
       </w:tr>
     </w:tbl>
-    <w:bookmarkEnd w:id="64"/>
-    <w:bookmarkStart w:id="65" w:name="monthly_selection.csv-月度选股调仓表"/>
+    <w:bookmarkEnd w:id="67"/>
+    <w:bookmarkStart w:id="68" w:name="monthly_selection.csv-月度选股调仓表"/>
     <w:p>
       <w:pPr>
         <w:pStyle w:val="Heading3"/>
@@ -17906,9 +17933,9 @@
         </w:tc>
       </w:tr>
     </w:tbl>
-    <w:bookmarkEnd w:id="65"/>
-    <w:bookmarkEnd w:id="66"/>
-    <w:bookmarkStart w:id="67" w:name="附录c完整指标表"/>
+    <w:bookmarkEnd w:id="68"/>
+    <w:bookmarkEnd w:id="69"/>
+    <w:bookmarkStart w:id="70" w:name="附录c完整指标表"/>
     <w:p>
       <w:pPr>
         <w:pStyle w:val="Heading2"/>
@@ -19856,8 +19883,8 @@
         </w:tc>
       </w:tr>
     </w:tbl>
-    <w:bookmarkEnd w:id="67"/>
-    <w:bookmarkStart w:id="68" w:name="附录d计算代码notebook路径"/>
+    <w:bookmarkEnd w:id="70"/>
+    <w:bookmarkStart w:id="71" w:name="附录d计算代码notebook路径"/>
     <w:p>
       <w:pPr>
         <w:pStyle w:val="Heading2"/>
@@ -20116,8 +20143,8 @@
         <w:t xml:space="preserve">：贡献度分析与攻防风格分析。</w:t>
       </w:r>
     </w:p>
-    <w:bookmarkEnd w:id="68"/>
-    <w:bookmarkEnd w:id="69"/>
+    <w:bookmarkEnd w:id="71"/>
+    <w:bookmarkEnd w:id="72"/>
     <w:sectPr>
       <w:footnotePr>
         <w:numRestart w:val="eachSect"/>

</xml_diff>